<commit_message>
Final SRS v2.0 - all Day tasks Done, RUL cap value confirmed (125 cycles)
</commit_message>
<xml_diff>
--- a/reports/SRS_v2.0.docx
+++ b/reports/SRS_v2.0.docx
@@ -4031,7 +4031,7 @@
                 <w:sz w:val="19"/>
                 <w:szCs w:val="19"/>
               </w:rPr>
-              <w:t xml:space="preserve">System shall cap RUL values (piecewise linear degradation model)</w:t>
+              <w:t xml:space="preserve">System shall cap RUL values at 125 cycles (piecewise linear degradation model)</w:t>
             </w:r>
           </w:p>
         </w:tc>
@@ -8069,7 +8069,7 @@
                 <w:sz w:val="19"/>
                 <w:szCs w:val="19"/>
               </w:rPr>
-              <w:t xml:space="preserve">Pending - after mentor review meeting</w:t>
+              <w:t xml:space="preserve">Done</w:t>
             </w:r>
           </w:p>
         </w:tc>
@@ -8092,7 +8092,7 @@
                 <w:sz w:val="19"/>
                 <w:szCs w:val="19"/>
               </w:rPr>
-              <w:t xml:space="preserve">Day 35-36 (rescheduled)</w:t>
+              <w:t xml:space="preserve">Day 45</w:t>
             </w:r>
           </w:p>
         </w:tc>
@@ -13669,7 +13669,7 @@
                 <w:sz w:val="19"/>
                 <w:szCs w:val="19"/>
               </w:rPr>
-              <w:t xml:space="preserve">Piecewise linear degradation model (per FR-D05)</w:t>
+              <w:t xml:space="preserve">125 cycles - piecewise linear degradation model (per FR-D05)</w:t>
             </w:r>
           </w:p>
         </w:tc>
@@ -19239,7 +19239,7 @@
                 <w:sz w:val="19"/>
                 <w:szCs w:val="19"/>
               </w:rPr>
-              <w:t xml:space="preserve">Pending - postponed until after in-person review with mentor</w:t>
+              <w:t xml:space="preserve">Done</w:t>
             </w:r>
           </w:p>
         </w:tc>
@@ -19337,7 +19337,7 @@
                 <w:sz w:val="19"/>
                 <w:szCs w:val="19"/>
               </w:rPr>
-              <w:t xml:space="preserve">Pending - postponed until after in-person review with mentor</w:t>
+              <w:t xml:space="preserve">Done</w:t>
             </w:r>
           </w:p>
         </w:tc>
@@ -19529,7 +19529,7 @@
                 <w:sz w:val="19"/>
                 <w:szCs w:val="19"/>
               </w:rPr>
-              <w:t xml:space="preserve">Pending</w:t>
+              <w:t xml:space="preserve">Done</w:t>
             </w:r>
           </w:p>
         </w:tc>
@@ -19623,7 +19623,7 @@
                 <w:sz w:val="19"/>
                 <w:szCs w:val="19"/>
               </w:rPr>
-              <w:t xml:space="preserve">Pending</w:t>
+              <w:t xml:space="preserve">Done</w:t>
             </w:r>
           </w:p>
         </w:tc>
@@ -19721,7 +19721,7 @@
                 <w:sz w:val="19"/>
                 <w:szCs w:val="19"/>
               </w:rPr>
-              <w:t xml:space="preserve">Pending</w:t>
+              <w:t xml:space="preserve">Done</w:t>
             </w:r>
           </w:p>
         </w:tc>
@@ -19815,7 +19815,7 @@
                 <w:sz w:val="19"/>
                 <w:szCs w:val="19"/>
               </w:rPr>
-              <w:t xml:space="preserve">Pending</w:t>
+              <w:t xml:space="preserve">Done</w:t>
             </w:r>
           </w:p>
         </w:tc>
@@ -19913,7 +19913,7 @@
                 <w:sz w:val="19"/>
                 <w:szCs w:val="19"/>
               </w:rPr>
-              <w:t xml:space="preserve">Pending</w:t>
+              <w:t xml:space="preserve">Done</w:t>
             </w:r>
           </w:p>
         </w:tc>
@@ -20440,7 +20440,7 @@
                 <w:sz w:val="19"/>
                 <w:szCs w:val="19"/>
               </w:rPr>
-              <w:t xml:space="preserve">Final Report/Presentation format is not yet confirmed by mentor</w:t>
+              <w:t xml:space="preserve">Final Report/Presentation format was not confirmed by mentor ahead of time</w:t>
             </w:r>
           </w:p>
         </w:tc>
@@ -20464,7 +20464,7 @@
                 <w:sz w:val="19"/>
                 <w:szCs w:val="19"/>
               </w:rPr>
-              <w:t xml:space="preserve">Postponed Day 35-36 deliverables until after in-person review with Umesh Chaturvedi Sir to avoid rework; all technical documentation (SRS, README, tests) completed independently in the meantime</w:t>
+              <w:t xml:space="preserve">Resolved - project reviewed and submitted to mentor on Day 45 (17 July); no rework was required</w:t>
             </w:r>
           </w:p>
         </w:tc>

</xml_diff>